<commit_message>
Remove prior-submission/desk-rejection reference from manuscript
Section 2.1 stated that an earlier version of this pipeline's
manuscript had been desk-rejected from a different journal, and framed
the present work as targeting a new venue rather than resubmitting
that draft. This manuscript is a new submission and should not
reference any prior submission or rejection history; removed the
sentence, keeping the rest of the paragraph's legitimate description
of TaghiBeyglou et al.'s original dataset and pipeline intact.

Co-Authored-By: Claude Sonnet 5 <noreply@anthropic.com>
Claude-Session: https://claude.ai/code/session_01AnoY3d9SFezxrJcUJbpz4T
</commit_message>
<xml_diff>
--- a/manuscript/manuscript.docx
+++ b/manuscript/manuscript.docx
@@ -231,16 +231,7 @@
     </w:p>
     <w:p>
       <w:r>
-        <w:t xml:space="preserve">The dataset used throughout this paper — 19-channel EEG from 61 children with ADHD and 60 typically developing controls, recorded during a visual attention task in which participants counted cartoon characters presented on screen — was introduced by TaghiBeyglou et al. [15], who also proposed the CNN-plus-classical-classifier pipeline that this study re-evaluates. Their design trains a compact CNN directly on raw, per-epoch, per-channel-normalized EEG, then reuses the trained network's penultimate dense layer as a fixed feature extractor for logistic regression, a radial-basis-function support vector machine, a linear support vector machine, random forest, Gaussian naive Bayes, and k-nearest neighbours. Under grouped ten-fold cross-validation, they reported pooled accuracies in roughly the 60–70% range for the plain CNN and several of its hybrid variants, a range broadly consistent with the epoch-level numbers we obtain under a considerably more conservative protocol (Section 4.3), even though our own subject-level, nested-cross-validation figures differ from any single pooled number their design produces, for the reasons discussed in Section 5.8. The original manuscript reporting an extension of this pipeline — the direct predecessor of the present reassessment — was desk-rejected from </w:t>
-      </w:r>
-      <w:r>
-        <w:rPr>
-          <w:i/>
-        </w:rPr>
-        <w:t>Computer Methods and Programs in Biomedicine Update</w:t>
-      </w:r>
-      <w:r>
-        <w:t>, the same journal in which TaghiBeyglou et al.'s original study appeared; the present manuscript targets a different venue and a substantially revised validation methodology rather than a resubmission of that earlier draft.</w:t>
+        <w:t>The dataset used throughout this paper — 19-channel EEG from 61 children with ADHD and 60 typically developing controls, recorded during a visual attention task in which participants counted cartoon characters presented on screen — was introduced by TaghiBeyglou et al. [15], who also proposed the CNN-plus-classical-classifier pipeline that this study re-evaluates. Their design trains a compact CNN directly on raw, per-epoch, per-channel-normalized EEG, then reuses the trained network's penultimate dense layer as a fixed feature extractor for logistic regression, a radial-basis-function support vector machine, a linear support vector machine, random forest, Gaussian naive Bayes, and k-nearest neighbours. Under grouped ten-fold cross-validation, they reported pooled accuracies in roughly the 60–70% range for the plain CNN and several of its hybrid variants, a range broadly consistent with the epoch-level numbers we obtain under a considerably more conservative protocol (Section 4.3), even though our own subject-level, nested-cross-validation figures differ from any single pooled number their design produces, for the reasons discussed in Section 5.8.</w:t>
       </w:r>
     </w:p>
     <w:p>

</xml_diff>

<commit_message>
Add author name, affiliation, and contact details
Single-author byline (Abinaya G, Saveetha Engineering College, Chennai)
filled in across manuscript.md, .tex (cas-sc frontmatter/backmatter:
author/affiliation/CRediT/competing-interests/funding), and .docx,
replacing the "To Be Inserted" placeholders.

Co-Authored-By: Claude Sonnet 5 <noreply@anthropic.com>
Claude-Session: https://claude.ai/code/session_01AnoY3d9SFezxrJcUJbpz4T
</commit_message>
<xml_diff>
--- a/manuscript/manuscript.docx
+++ b/manuscript/manuscript.docx
@@ -8,6 +8,30 @@
       </w:pPr>
       <w:r>
         <w:t>Subject-Independent Detection of ADHD from Raw EEG: A Nested Cross-Validation Reassessment of CNN and Hybrid Classifiers</w:t>
+      </w:r>
+    </w:p>
+    <w:p>
+      <w:r>
+        <w:rPr>
+          <w:b/>
+        </w:rPr>
+        <w:t>Abinaya G</w:t>
+      </w:r>
+    </w:p>
+    <w:p>
+      <w:r>
+        <w:rPr>
+          <w:i/>
+        </w:rPr>
+        <w:t>Saveetha Engineering College, Chennai, Tamil Nadu, India</w:t>
+      </w:r>
+    </w:p>
+    <w:p>
+      <w:r>
+        <w:rPr>
+          <w:i/>
+        </w:rPr>
+        <w:t>Corresponding author: abinaya.g05@gmail.com</w:t>
       </w:r>
     </w:p>
     <w:p>

</xml_diff>